<commit_message>
Wyśrodkuj i powiększ tytuł główny druku IPET
Tytuł na stronie 1 zgodnie ze standardem pozostałych druków PCTP:
wyśrodkowany, wersaliki, 26 pt (było 15 pt, do lewej), z pomarańczową
linią pod tytułem i wyśrodkowanym nadtytułem oraz podtytułem.

Opis dokumentu i podstawa prawna pozostają w bloku-syntezie (do lewej).
Dokument nadal renderuje się na dokładnie 21 stronach A4.

Co-Authored-By: Claude Opus 5 <noreply@anthropic.com>
Claude-Session: https://claude.ai/code/session_01SeifS2KD7HjYDs7PYVUEPZ
</commit_message>
<xml_diff>
--- a/druki/IPET_2026_przedszkole/IPET_2026_druk_przedszkole.docx
+++ b/druki/IPET_2026_przedszkole/IPET_2026_druk_przedszkole.docx
@@ -417,8 +417,93 @@
     </w:p>
     <w:p>
       <w:pPr>
-        <w:spacing w:after="60"/>
+        <w:spacing w:after="220"/>
       </w:pPr>
+    </w:p>
+    <w:p>
+      <w:pPr>
+        <w:spacing w:after="180" w:before="0" w:line="250"/>
+        <w:jc w:val="center"/>
+      </w:pPr>
+      <w:r>
+        <w:rPr>
+          <w:rFonts w:ascii="Arial" w:cs="Arial" w:eastAsia="Arial" w:hAnsi="Arial"/>
+          <w:b/>
+          <w:bCs/>
+          <w:i w:val="false"/>
+          <w:iCs w:val="false"/>
+          <w:caps w:val="false"/>
+          <w:color w:val="E8450A"/>
+          <w:spacing w:val="16"/>
+          <w:sz w:val="15"/>
+          <w:szCs w:val="15"/>
+        </w:rPr>
+        <w:t xml:space="preserve">IPET 2026 · WOPF (ICF) · STANDARD 2026</w:t>
+      </w:r>
+    </w:p>
+    <w:p>
+      <w:pPr>
+        <w:spacing w:after="40" w:before="0" w:line="560"/>
+        <w:jc w:val="center"/>
+      </w:pPr>
+      <w:r>
+        <w:rPr>
+          <w:rFonts w:ascii="Arial" w:cs="Arial" w:eastAsia="Arial" w:hAnsi="Arial"/>
+          <w:b/>
+          <w:bCs/>
+          <w:i w:val="false"/>
+          <w:iCs w:val="false"/>
+          <w:caps w:val="false"/>
+          <w:color w:val="2D1B69"/>
+          <w:sz w:val="52"/>
+          <w:szCs w:val="52"/>
+        </w:rPr>
+        <w:t xml:space="preserve">INDYWIDUALNY PROGRAM</w:t>
+      </w:r>
+    </w:p>
+    <w:p>
+      <w:pPr>
+        <w:pBdr>
+          <w:bottom w:val="single" w:color="E8450A" w:sz="22" w:space="10"/>
+        </w:pBdr>
+        <w:spacing w:after="0" w:line="560"/>
+        <w:jc w:val="center"/>
+      </w:pPr>
+      <w:r>
+        <w:rPr>
+          <w:rFonts w:ascii="Arial" w:cs="Arial" w:eastAsia="Arial" w:hAnsi="Arial"/>
+          <w:b/>
+          <w:bCs/>
+          <w:i w:val="false"/>
+          <w:iCs w:val="false"/>
+          <w:caps w:val="false"/>
+          <w:color w:val="2D1B69"/>
+          <w:sz w:val="52"/>
+          <w:szCs w:val="52"/>
+        </w:rPr>
+        <w:t xml:space="preserve">EDUKACYJNO-TERAPEUTYCZNY</w:t>
+      </w:r>
+    </w:p>
+    <w:p>
+      <w:pPr>
+        <w:spacing w:after="240" w:before="150" w:line="250"/>
+        <w:jc w:val="center"/>
+      </w:pPr>
+      <w:r>
+        <w:rPr>
+          <w:rFonts w:ascii="Arial" w:cs="Arial" w:eastAsia="Arial" w:hAnsi="Arial"/>
+          <w:b w:val="false"/>
+          <w:bCs w:val="false"/>
+          <w:i w:val="false"/>
+          <w:iCs w:val="false"/>
+          <w:caps w:val="false"/>
+          <w:color w:val="E8450A"/>
+          <w:spacing w:val="10"/>
+          <w:sz w:val="19"/>
+          <w:szCs w:val="19"/>
+        </w:rPr>
+        <w:t xml:space="preserve">SYNTEZA ZINTEGROWANA  ·  WERSJA PRZEDSZKOLNA</w:t>
+      </w:r>
     </w:p>
     <w:tbl>
       <w:tblPr>
@@ -453,88 +538,6 @@
               <w:right w:type="dxa" w:w="150"/>
             </w:tcMar>
           </w:tcPr>
-          <w:p>
-            <w:pPr>
-              <w:spacing w:after="70" w:before="0" w:line="250"/>
-              <w:jc w:val="left"/>
-            </w:pPr>
-            <w:r>
-              <w:rPr>
-                <w:rFonts w:ascii="Arial" w:cs="Arial" w:eastAsia="Arial" w:hAnsi="Arial"/>
-                <w:b/>
-                <w:bCs/>
-                <w:i w:val="false"/>
-                <w:iCs w:val="false"/>
-                <w:caps w:val="false"/>
-                <w:color w:val="E8450A"/>
-                <w:spacing w:val="14"/>
-                <w:sz w:val="12"/>
-                <w:szCs w:val="12"/>
-              </w:rPr>
-              <w:t xml:space="preserve">IPET 2026 · WOPF (ICF) · STANDARD 2026</w:t>
-            </w:r>
-          </w:p>
-          <w:p>
-            <w:pPr>
-              <w:spacing w:after="0" w:before="0" w:line="300"/>
-              <w:jc w:val="left"/>
-            </w:pPr>
-            <w:r>
-              <w:rPr>
-                <w:rFonts w:ascii="Arial" w:cs="Arial" w:eastAsia="Arial" w:hAnsi="Arial"/>
-                <w:b/>
-                <w:bCs/>
-                <w:i w:val="false"/>
-                <w:iCs w:val="false"/>
-                <w:caps w:val="false"/>
-                <w:color w:val="2D1B69"/>
-                <w:sz w:val="30"/>
-                <w:szCs w:val="30"/>
-              </w:rPr>
-              <w:t xml:space="preserve">Indywidualny Program</w:t>
-            </w:r>
-          </w:p>
-          <w:p>
-            <w:pPr>
-              <w:spacing w:after="70" w:before="0" w:line="300"/>
-              <w:jc w:val="left"/>
-            </w:pPr>
-            <w:r>
-              <w:rPr>
-                <w:rFonts w:ascii="Arial" w:cs="Arial" w:eastAsia="Arial" w:hAnsi="Arial"/>
-                <w:b/>
-                <w:bCs/>
-                <w:i w:val="false"/>
-                <w:iCs w:val="false"/>
-                <w:caps w:val="false"/>
-                <w:color w:val="2D1B69"/>
-                <w:sz w:val="30"/>
-                <w:szCs w:val="30"/>
-              </w:rPr>
-              <w:t xml:space="preserve">Edukacyjno-Terapeutyczny</w:t>
-            </w:r>
-          </w:p>
-          <w:p>
-            <w:pPr>
-              <w:spacing w:after="120" w:before="0" w:line="250"/>
-              <w:jc w:val="left"/>
-            </w:pPr>
-            <w:r>
-              <w:rPr>
-                <w:rFonts w:ascii="Arial" w:cs="Arial" w:eastAsia="Arial" w:hAnsi="Arial"/>
-                <w:b/>
-                <w:bCs/>
-                <w:i w:val="false"/>
-                <w:iCs w:val="false"/>
-                <w:caps w:val="false"/>
-                <w:color w:val="5B5B72"/>
-                <w:spacing w:val="16"/>
-                <w:sz w:val="13"/>
-                <w:szCs w:val="13"/>
-              </w:rPr>
-              <w:t xml:space="preserve">SYNTEZA ZINTEGROWANA</w:t>
-            </w:r>
-          </w:p>
           <w:p>
             <w:pPr>
               <w:spacing w:after="80" w:before="0" w:line="250"/>

</xml_diff>